<commit_message>
docs(art): add prominent disclaimer clarifying all current art, names and game title are 100% placeholders
</commit_message>
<xml_diff>
--- a/docs/art/Astra_Dream_Guia_Maestra_Creativa.docx
+++ b/docs/art/Astra_Dream_Guia_Maestra_Creativa.docx
@@ -93,6 +93,68 @@
         <w:t>🧭 1. Manifiesto y Visión: Libertad Creativa con Anclaje Sistémico</w:t>
       </w:r>
     </w:p>
+    <w:tbl>
+      <w:tblPr>
+        <w:tblW w:type="auto" w:w="0"/>
+        <w:jc w:val="center"/>
+        <w:tblLayout w:type="fixed"/>
+        <w:tblLook w:firstColumn="1" w:firstRow="1" w:lastColumn="0" w:lastRow="0" w:noHBand="0" w:noVBand="1" w:val="04A0"/>
+      </w:tblPr>
+      <w:tblGrid>
+        <w:gridCol w:w="9360"/>
+      </w:tblGrid>
+      <w:tr>
+        <w:tc>
+          <w:tcPr>
+            <w:tcW w:type="dxa" w:w="9648"/>
+            <w:shd w:fill="FEF2F2"/>
+            <w:tcMar>
+              <w:top w:w="160" w:type="dxa"/>
+              <w:bottom w:w="160" w:type="dxa"/>
+              <w:left w:w="240" w:type="dxa"/>
+              <w:right w:w="200" w:type="dxa"/>
+            </w:tcMar>
+            <w:tcBorders>
+              <w:left w:val="single" w:sz="24" w:space="0" w:color="DC2626"/>
+              <w:top w:val="none" w:sz="4" w:space="0" w:color="CCCCCC"/>
+              <w:right w:val="none" w:sz="4" w:space="0" w:color="CCCCCC"/>
+              <w:bottom w:val="none" w:sz="4" w:space="0" w:color="CCCCCC"/>
+            </w:tcBorders>
+          </w:tcPr>
+          <w:p>
+            <w:pPr>
+              <w:spacing w:before="40" w:after="40" w:line="276" w:lineRule="auto"/>
+            </w:pPr>
+            <w:r>
+              <w:rPr>
+                <w:rFonts w:ascii="Arial" w:hAnsi="Arial"/>
+                <w:b/>
+                <w:color w:val="004D66"/>
+                <w:sz w:val="21"/>
+              </w:rPr>
+              <w:t>🚨 AVISO FUNDAMENTAL: TODO EL APARTADO VISUAL, NARRATIVO Y EL TÍTULO SON PLACEHOLDERS</w:t>
+              <w:br/>
+            </w:r>
+            <w:r>
+              <w:rPr>
+                <w:rFonts w:ascii="Arial" w:hAnsi="Arial"/>
+                <w:color w:val="222222"/>
+                <w:sz w:val="20"/>
+              </w:rPr>
+              <w:t>El título actual del proyecto ('Astra Dream'), los nombres de las heroínas (Astra, Ignis, Zephyr, Nyx, etc.), los nombres de las navegadoras, mascotas, armas, regiones, ítems y habilidades son 100% MARCADORES DE POSICIÓN (PLACEHOLDERS) PROVISIONALES.</w:t>
+              <w:br/>
+              <w:br/>
+              <w:t>Como Artista Principal y Director Creativo posees AUTORIDAD Y LIBERTAD TOTAL para definir el nombre comercial definitivo del juego, renombrar a las pilotos y mascotas, crear nuevas facciones y sustituir cualquier concepto estético, narrativo o sonoro. Tu única frontera son los sistemas mecánicos del motor (vuelo 360°, satélites, talentos, moral de rivales y Dialogic).</w:t>
+            </w:r>
+          </w:p>
+        </w:tc>
+      </w:tr>
+    </w:tbl>
+    <w:p>
+      <w:pPr>
+        <w:spacing w:before="80" w:after="120"/>
+      </w:pPr>
+    </w:p>
     <w:p>
       <w:pPr>
         <w:spacing w:before="0" w:after="120" w:line="276" w:lineRule="auto"/>
@@ -103,7 +165,7 @@
           <w:color w:val="2D3748"/>
           <w:sz w:val="21"/>
         </w:rPr>
-        <w:t>Este documento corona y sintetiza la serie de especificaciones del proyecto. Tu rol no es simplemente 'dibujar sprites o componer pistas sueltas', sino definir el alma, el tono, la identidad sensorial y la emoción de todo el universo de Astra Dream.</w:t>
+        <w:t>Este documento corona y sintetiza la serie de especificaciones del proyecto. Tu rol no es simplemente 'dibujar sprites o componer pistas sueltas', sino definir el alma, el tono, la identidad sensorial, el nombre y la emoción de todo este universo.</w:t>
       </w:r>
     </w:p>
     <w:tbl>
@@ -154,7 +216,7 @@
                 <w:color w:val="222222"/>
                 <w:sz w:val="20"/>
               </w:rPr>
-              <w:t>• TU ESPACIO LIBRE: Tienes total autonomía para definir el estilo visual (Anime Mecha-Musume / Sci-Fi / Cyberpunk), los shaders, la arquitectura del Hangar 2.5D, la paleta cromática, el género musical (Synthwave, Dark Synth, Metal Orquestal) y la personalidad de las pilotos.</w:t>
+              <w:t>• TU ESPACIO LIBRE (100% PLACEHOLDER): Tienes total autonomía para definir el nombre final del juego, el estilo visual (Anime Mecha-Musume / Sci-Fi / Cyberpunk), los shaders, la arquitectura del Hangar 2.5D, la paleta cromática, el género musical (Synthwave, Dark Synth, Metal Orquestal) y la personalidad de las pilotos.</w:t>
               <w:br/>
               <w:br/>
               <w:t>• EL MOTOR Y SISTEMAS: El gameplay loop de 360°, el sistema de Satélites, el motor de diálogos Dialogic 2, el sistema de perdón/combate de Pilotos Rivales y la meta-progresión son las anclas sólidas sobre las que se apoya tu arte.</w:t>

</xml_diff>